<commit_message>
Started working on Milestone 02
Wrote the Lit. Review Introduction and reviewed the papers that will be included within this section. Also started working on the Lit. Map
</commit_message>
<xml_diff>
--- a/doc/milestone_01/miguelabela_swd63a_milestone_01.docx
+++ b/doc/milestone_01/miguelabela_swd63a_milestone_01.docx
@@ -28,6 +28,12 @@
           <w:lang w:val="en-US"/>
         </w:rPr>
         <w:t>Section 1</w:t>
+      </w:r>
+      <w:r>
+        <w:rPr>
+          <w:lang w:val="en-US"/>
+        </w:rPr>
+        <w:t xml:space="preserve"> – Introduction</w:t>
       </w:r>
     </w:p>
     <w:p>

</xml_diff>

<commit_message>
Finsihed Milestone 02, started working on Milestone 03
Finished the Lit. Rev., including the Lit Map for the paper. Started working on the Research Methodology: wrote the aim and the research questions.
</commit_message>
<xml_diff>
--- a/doc/milestone_01/miguelabela_swd63a_milestone_01.docx
+++ b/doc/milestone_01/miguelabela_swd63a_milestone_01.docx
@@ -821,6 +821,12 @@
         <w:rPr>
           <w:lang w:val="en-US"/>
         </w:rPr>
+        <w:t xml:space="preserve">regressor </w:t>
+      </w:r>
+      <w:r>
+        <w:rPr>
+          <w:lang w:val="en-US"/>
+        </w:rPr>
         <w:t>models</w:t>
       </w:r>
       <w:r>
@@ -923,7 +929,7 @@
         <w:rPr>
           <w:lang w:val="en-US"/>
         </w:rPr>
-        <w:t>performance and robustness</w:t>
+        <w:t>performance</w:t>
       </w:r>
       <w:r>
         <w:rPr>
@@ -983,26 +989,26 @@
         <w:rPr>
           <w:lang w:val="en-US"/>
         </w:rPr>
-        <w:t xml:space="preserve">predictive </w:t>
+        <w:t>predictive performance</w:t>
+      </w:r>
+      <w:r>
+        <w:rPr>
+          <w:lang w:val="en-US"/>
+        </w:rPr>
+        <w:t xml:space="preserve"> than </w:t>
+      </w:r>
+      <w:r>
+        <w:rPr>
+          <w:lang w:val="en-US"/>
+        </w:rPr>
+        <w:t xml:space="preserve">an </w:t>
       </w:r>
       <w:r>
         <w:rPr>
           <w:lang w:val="en-US"/>
         </w:rPr>
         <w:lastRenderedPageBreak/>
-        <w:t>performance</w:t>
-      </w:r>
-      <w:r>
-        <w:rPr>
-          <w:lang w:val="en-US"/>
-        </w:rPr>
-        <w:t xml:space="preserve"> than </w:t>
-      </w:r>
-      <w:r>
-        <w:rPr>
-          <w:lang w:val="en-US"/>
-        </w:rPr>
-        <w:t>an RF regressor</w:t>
+        <w:t>RF regressor</w:t>
       </w:r>
       <w:r>
         <w:rPr>

</xml_diff>

<commit_message>
Minor update to the Methodology
</commit_message>
<xml_diff>
--- a/doc/milestone_01/miguelabela_swd63a_milestone_01.docx
+++ b/doc/milestone_01/miguelabela_swd63a_milestone_01.docx
@@ -90,13 +90,13 @@
         <w:rPr>
           <w:lang w:val="en-US"/>
         </w:rPr>
-        <w:t>-</w:t>
-      </w:r>
-      <w:r>
-        <w:rPr>
-          <w:lang w:val="en-US"/>
-        </w:rPr>
-        <w:t>4].</w:t>
+        <w:t>] – [4]</w:t>
+      </w:r>
+      <w:r>
+        <w:rPr>
+          <w:lang w:val="en-US"/>
+        </w:rPr>
+        <w:t>.</w:t>
       </w:r>
       <w:r>
         <w:rPr>

</xml_diff>